<commit_message>
Refine MPLS artifacts with Internet links and pricing details
</commit_message>
<xml_diff>
--- a/ARTEFATOS_MPLS/DFD_MPLS_TRT10.docx
+++ b/ARTEFATOS_MPLS/DFD_MPLS_TRT10.docx
@@ -9794,7 +9794,111 @@
     </w:p>
     <w:p>
       <w:r>
-        <w:t>A demanda possui vinculação técnica com o contrato SD-WAN vigente, redes JT, Infovia, firewalls, segurança perimetral, monitoramento, datacenter, DNS, autenticação, roteamento e políticas de continuidade. Os links de Internet centralizados fazem parte do objeto e deverão operar como os pontos oficiais de egressão à Internet do Tribunal.</w:t>
+        <w:t xml:space="preserve">A demanda possui vinculação técnica direta com a conectividade institucional atualmente em operação, em especial com o </w:t>
+      </w:r>
+      <w:r>
+        <w:rPr>
+          <w:b/>
+        </w:rPr>
+        <w:t>Contrato 131/2023</w:t>
+      </w:r>
+      <w:r>
+        <w:t xml:space="preserve">, relacionado à prestação de link IP dedicado com SD-WAN, instruído no </w:t>
+      </w:r>
+      <w:r>
+        <w:rPr>
+          <w:b/>
+        </w:rPr>
+        <w:t>SEI 0000030-87.2023.5.10.8000</w:t>
+      </w:r>
+      <w:r>
+        <w:t>. Esse contrato é referência para a topologia vigente, para as capacidades atualmente consideradas por localidade e para a integração operacional entre Sede, Foro de Brasília, Prédio de Apoio, Taguatinga, Palmas, Gama, Araguaína, Gurupi, Dianópolis e Guaraí.</w:t>
+      </w:r>
+    </w:p>
+    <w:p>
+      <w:r>
+        <w:t xml:space="preserve">Também devem ser considerados, como referências históricas e contratações correlatas de conectividade, os processos </w:t>
+      </w:r>
+      <w:r>
+        <w:rPr>
+          <w:b/>
+        </w:rPr>
+        <w:t>SEI 0007608-72.2021.5.10.8000</w:t>
+      </w:r>
+      <w:r>
+        <w:t xml:space="preserve"> e </w:t>
+      </w:r>
+      <w:r>
+        <w:rPr>
+          <w:b/>
+        </w:rPr>
+        <w:t>SEI 0002027-76.2021.5.10.8000</w:t>
+      </w:r>
+      <w:r>
+        <w:t>, já indicados neste DFD como processos administrativos relacionados à contratação em vigor ou ao histórico de comunicação de dados. Esses processos devem ser consultados durante a instrução para identificar contratos, atas, prazos, obrigações, pontos de integração, escopos residuais e eventuais riscos de sobreposição com a nova contratação.</w:t>
+      </w:r>
+    </w:p>
+    <w:p>
+      <w:r>
+        <w:t>A nova solução também depende de integração técnica com serviços e contratos correlatos que não constituem, por si só, substituição do objeto aqui pretendido, mas condicionam sua implantação segura:</w:t>
+      </w:r>
+    </w:p>
+    <w:p>
+      <w:pPr>
+        <w:pStyle w:val="ListBullet"/>
+      </w:pPr>
+      <w:r>
+        <w:t>redes da Justiça do Trabalho e demais redes institucionais externas, que dependem de rotas, filtros e políticas de acesso coordenadas com a CDTEC;</w:t>
+      </w:r>
+    </w:p>
+    <w:p>
+      <w:pPr>
+        <w:pStyle w:val="ListBullet"/>
+      </w:pPr>
+      <w:r>
+        <w:t>Infovia, quando utilizada como meio institucional de comunicação, contingência ou interligação com serviços externos;</w:t>
+      </w:r>
+    </w:p>
+    <w:p>
+      <w:pPr>
+        <w:pStyle w:val="ListBullet"/>
+      </w:pPr>
+      <w:r>
+        <w:t>firewalls, segurança perimetral, VPNs, políticas de NAT, publicação de serviços e inspeção de tráfego;</w:t>
+      </w:r>
+    </w:p>
+    <w:p>
+      <w:pPr>
+        <w:pStyle w:val="ListBullet"/>
+      </w:pPr>
+      <w:r>
+        <w:t>serviços de DNS, autenticação, diretórios, certificados, monitoramento, logs, SIEM ou plataforma equivalente;</w:t>
+      </w:r>
+    </w:p>
+    <w:p>
+      <w:pPr>
+        <w:pStyle w:val="ListBullet"/>
+      </w:pPr>
+      <w:r>
+        <w:t>infraestrutura de datacenter, backup, replicação e continuidade, especialmente para uso do link dedicado Sede-Foro de 25 Gbps;</w:t>
+      </w:r>
+    </w:p>
+    <w:p>
+      <w:pPr>
+        <w:pStyle w:val="ListBullet"/>
+      </w:pPr>
+      <w:r>
+        <w:t>políticas de roteamento, QoS, segmentação, failover e retorno ao caminho preferencial entre MPLS, SD-WAN, Internet da Sede e Internet do Foro.</w:t>
+      </w:r>
+    </w:p>
+    <w:p>
+      <w:r>
+        <w:t>Os links de Internet centralizados fazem parte do objeto desta contratação e deverão operar como os pontos oficiais de egressão à Internet do Tribunal. A Sede será o ponto principal; o Foro de Brasília será o ponto redundante. Durante a implantação, a Administração deverá preservar a continuidade dos serviços atualmente suportados pelo Contrato 131/2023 e pelos processos correlatos, evitando interrupção abrupta de rotas, túneis, regras de firewall, DNS, autenticação, monitoramento e acessos externos.</w:t>
+      </w:r>
+    </w:p>
+    <w:p>
+      <w:r>
+        <w:t>Antes da publicação do edital, a área de contratos deverá confirmar, nos autos dos processos citados, a situação vigente dos instrumentos relacionados, incluindo vigência, objeto, itens ativos, fornecedores, localidades atendidas, responsabilidades de suporte, prazos de transição e eventuais cláusulas que impactem a convivência entre a SD-WAN atual, a nova rede MPLS, o link dedicado Sede-Foro e os links centralizados de Internet.</w:t>
       </w:r>
     </w:p>
     <w:p>
@@ -9847,7 +9951,17 @@
     </w:p>
     <w:p>
       <w:r>
-        <w:t>Contrato 131/2023 relacionado a link IP dedicado com SD-WAN. A área de contratos deverá conferir instrumentos vigentes que interajam com a conectividade institucional para preservar continuidade operacional durante a implantação.</w:t>
+        <w:t>Contrato 131/2023, vinculado ao SEI 0000030-87.2023.5.10.8000, relacionado a link IP dedicado com SD-WAN e à conectividade de dados atualmente utilizada como referência para a topologia das unidades.</w:t>
+      </w:r>
+    </w:p>
+    <w:p>
+      <w:r>
+        <w:t>Também devem ser considerados, para fins de conferência dos links de dados e de Internet em vigor ou historicamente vinculados à conectividade institucional, os processos SEI 0007608-72.2021.5.10.8000 e SEI 0002027-76.2021.5.10.8000. Esses processos deverão ser verificados pela área de contratos para identificação dos contratos ou ARPs correspondentes, fornecedores, vigência, localidades atendidas, capacidades contratadas, serviços de Internet/dados, blocos de IP fixo, suporte, SLA e regras de transição.</w:t>
+      </w:r>
+    </w:p>
+    <w:p>
+      <w:r>
+        <w:t>A área de contratos deverá conferir, antes da publicação do edital, todos os instrumentos vigentes que interajam com a conectividade institucional, especialmente links de dados, links de Internet, SD-WAN, segurança de borda, DNS, roteamento, monitoramento e serviços correlatos, para preservar a continuidade operacional e evitar sobreposição de escopo durante a implantação.</w:t>
       </w:r>
     </w:p>
     <w:p>

</xml_diff>